<commit_message>
Moved piece 3 to done. Updated Piece 1 Bio, synopsis
</commit_message>
<xml_diff>
--- a/Front Matter/Composer Details/1/狮城漫步 A Stroll in the Lion City - Synopsis.docx
+++ b/Front Matter/Composer Details/1/狮城漫步 A Stroll in the Lion City - Synopsis.docx
@@ -1,6 +1,6 @@
 
 <file path=word/document.xml><?xml version="1.0" encoding="utf-8"?>
-<w:document xmlns:wpc="http://schemas.microsoft.com/office/word/2010/wordprocessingCanvas" xmlns:cx="http://schemas.microsoft.com/office/drawing/2014/chartex" xmlns:cx1="http://schemas.microsoft.com/office/drawing/2015/9/8/chartex" xmlns:cx2="http://schemas.microsoft.com/office/drawing/2015/10/21/chartex" xmlns:cx3="http://schemas.microsoft.com/office/drawing/2016/5/9/chartex" xmlns:cx4="http://schemas.microsoft.com/office/drawing/2016/5/10/chartex" xmlns:cx5="http://schemas.microsoft.com/office/drawing/2016/5/11/chartex" xmlns:cx6="http://schemas.microsoft.com/office/drawing/2016/5/12/chartex" xmlns:cx7="http://schemas.microsoft.com/office/drawing/2016/5/13/chartex" xmlns:cx8="http://schemas.microsoft.com/office/drawing/2016/5/14/chartex" xmlns:mc="http://schemas.openxmlformats.org/markup-compatibility/2006" xmlns:aink="http://schemas.microsoft.com/office/drawing/2016/ink" xmlns:am3d="http://schemas.microsoft.com/office/drawing/2017/model3d" xmlns:o="urn:schemas-microsoft-com:office:office" xmlns:r="http://schemas.openxmlformats.org/officeDocument/2006/relationships" xmlns:m="http://schemas.openxmlformats.org/officeDocument/2006/math" xmlns:v="urn:schemas-microsoft-com:vml" xmlns:wp14="http://schemas.microsoft.com/office/word/2010/wordprocessingDrawing" xmlns:wp="http://schemas.openxmlformats.org/drawingml/2006/wordprocessingDrawing" xmlns:w10="urn:schemas-microsoft-com:office:word" xmlns:w="http://schemas.openxmlformats.org/wordprocessingml/2006/main" xmlns:w14="http://schemas.microsoft.com/office/word/2010/wordml" xmlns:w15="http://schemas.microsoft.com/office/word/2012/wordml" xmlns:w16cid="http://schemas.microsoft.com/office/word/2016/wordml/cid" xmlns:w16se="http://schemas.microsoft.com/office/word/2015/wordml/symex" xmlns:wpg="http://schemas.microsoft.com/office/word/2010/wordprocessingGroup" xmlns:wpi="http://schemas.microsoft.com/office/word/2010/wordprocessingInk" xmlns:wne="http://schemas.microsoft.com/office/word/2006/wordml" xmlns:wps="http://schemas.microsoft.com/office/word/2010/wordprocessingShape" mc:Ignorable="w14 w15 w16se w16cid wp14">
+<w:document xmlns:wpc="http://schemas.microsoft.com/office/word/2010/wordprocessingCanvas" xmlns:cx="http://schemas.microsoft.com/office/drawing/2014/chartex" xmlns:cx1="http://schemas.microsoft.com/office/drawing/2015/9/8/chartex" xmlns:cx2="http://schemas.microsoft.com/office/drawing/2015/10/21/chartex" xmlns:cx3="http://schemas.microsoft.com/office/drawing/2016/5/9/chartex" xmlns:cx4="http://schemas.microsoft.com/office/drawing/2016/5/10/chartex" xmlns:cx5="http://schemas.microsoft.com/office/drawing/2016/5/11/chartex" xmlns:cx6="http://schemas.microsoft.com/office/drawing/2016/5/12/chartex" xmlns:cx7="http://schemas.microsoft.com/office/drawing/2016/5/13/chartex" xmlns:cx8="http://schemas.microsoft.com/office/drawing/2016/5/14/chartex" xmlns:mc="http://schemas.openxmlformats.org/markup-compatibility/2006" xmlns:aink="http://schemas.microsoft.com/office/drawing/2016/ink" xmlns:am3d="http://schemas.microsoft.com/office/drawing/2017/model3d" xmlns:o="urn:schemas-microsoft-com:office:office" xmlns:oel="http://schemas.microsoft.com/office/2019/extlst" xmlns:r="http://schemas.openxmlformats.org/officeDocument/2006/relationships" xmlns:m="http://schemas.openxmlformats.org/officeDocument/2006/math" xmlns:v="urn:schemas-microsoft-com:vml" xmlns:wp14="http://schemas.microsoft.com/office/word/2010/wordprocessingDrawing" xmlns:wp="http://schemas.openxmlformats.org/drawingml/2006/wordprocessingDrawing" xmlns:w10="urn:schemas-microsoft-com:office:word" xmlns:w="http://schemas.openxmlformats.org/wordprocessingml/2006/main" xmlns:w14="http://schemas.microsoft.com/office/word/2010/wordml" xmlns:w15="http://schemas.microsoft.com/office/word/2012/wordml" xmlns:w16cex="http://schemas.microsoft.com/office/word/2018/wordml/cex" xmlns:w16cid="http://schemas.microsoft.com/office/word/2016/wordml/cid" xmlns:w16="http://schemas.microsoft.com/office/word/2018/wordml" xmlns:w16du="http://schemas.microsoft.com/office/word/2023/wordml/word16du" xmlns:w16sdtdh="http://schemas.microsoft.com/office/word/2020/wordml/sdtdatahash" xmlns:w16se="http://schemas.microsoft.com/office/word/2015/wordml/symex" xmlns:wpg="http://schemas.microsoft.com/office/word/2010/wordprocessingGroup" xmlns:wpi="http://schemas.microsoft.com/office/word/2010/wordprocessingInk" xmlns:wne="http://schemas.microsoft.com/office/word/2006/wordml" xmlns:wps="http://schemas.microsoft.com/office/word/2010/wordprocessingShape" mc:Ignorable="w14 w15 w16se w16cid w16 w16cex w16sdtdh w16du wp14">
   <w:body>
     <w:p>
       <w:r>
@@ -9,18 +9,15 @@
     </w:p>
     <w:p>
       <w:r>
-        <w:t xml:space="preserve">Singapore’s multi-racial culture left a deep impression on the composer. Born in the southern part of Fujian province but brought up in the Shanghai metropolis, the composer was strongly attracted and took a special liking to Singapore’s rich flavour of a modern metropolis with an eastern China’s cultural atmosphere. The composition emphasises the vibrant, elegant and bustling city life and describes the charms of </w:t>
-      </w:r>
-      <w:r>
-        <w:t>N</w:t>
-      </w:r>
-      <w:r>
-        <w:t>anyang. It depicts scenes of its rich and diverse sentiments, integrated with aspects of traditional Chinese culture. The composer adopts an array of composition techniques with a combination of elements from various influences, including the southern Chinese, western modern, classical and romantic music to reflect the diversity and inner spirit of Singapore.</w:t>
+        <w:t>Singapore’s multi-racial culture left a deep impression on the composer. Born in the southern part of Fujian province but brought up in the Shanghai metropolis, the composer was strongly attracted and took a special liking to Singapore’s rich flavour of a modern metropolis with an eastern China’s cultural atmosphere. The composition emphasises the vibrant, elegant and bustling city life and describes the charms of Nanyang. It depicts scenes of its rich and diverse sentiments, integrated with aspects of traditional Chinese culture. The composer adopts an array of composition techniques with a combination of elements from various influences, including the southern Chinese, western modern, classical and romantic music to reflect the diversity and inner spirit of Singapore.</w:t>
       </w:r>
     </w:p>
     <w:p>
       <w:r>
         <w:t>This piece won the First Prize at the Singapore International Competition for Chinese Orchestral Composition 2011</w:t>
+      </w:r>
+      <w:r>
+        <w:t>.</w:t>
       </w:r>
     </w:p>
     <w:p/>
@@ -54,8 +51,6 @@
         </w:rPr>
         <w:t xml:space="preserve">, </w:t>
       </w:r>
-      <w:bookmarkStart w:id="0" w:name="_GoBack"/>
-      <w:bookmarkEnd w:id="0"/>
       <w:r>
         <w:rPr>
           <w:rFonts w:ascii="Arial" w:hAnsi="Arial" w:cs="Arial"/>
@@ -150,7 +145,7 @@
 </file>
 
 <file path=word/styles.xml><?xml version="1.0" encoding="utf-8"?>
-<w:styles xmlns:mc="http://schemas.openxmlformats.org/markup-compatibility/2006" xmlns:r="http://schemas.openxmlformats.org/officeDocument/2006/relationships" xmlns:w="http://schemas.openxmlformats.org/wordprocessingml/2006/main" xmlns:w14="http://schemas.microsoft.com/office/word/2010/wordml" xmlns:w15="http://schemas.microsoft.com/office/word/2012/wordml" xmlns:w16cid="http://schemas.microsoft.com/office/word/2016/wordml/cid" xmlns:w16se="http://schemas.microsoft.com/office/word/2015/wordml/symex" mc:Ignorable="w14 w15 w16se w16cid">
+<w:styles xmlns:mc="http://schemas.openxmlformats.org/markup-compatibility/2006" xmlns:r="http://schemas.openxmlformats.org/officeDocument/2006/relationships" xmlns:w="http://schemas.openxmlformats.org/wordprocessingml/2006/main" xmlns:w14="http://schemas.microsoft.com/office/word/2010/wordml" xmlns:w15="http://schemas.microsoft.com/office/word/2012/wordml" xmlns:w16cex="http://schemas.microsoft.com/office/word/2018/wordml/cex" xmlns:w16cid="http://schemas.microsoft.com/office/word/2016/wordml/cid" xmlns:w16="http://schemas.microsoft.com/office/word/2018/wordml" xmlns:w16du="http://schemas.microsoft.com/office/word/2023/wordml/word16du" xmlns:w16sdtdh="http://schemas.microsoft.com/office/word/2020/wordml/sdtdatahash" xmlns:w16se="http://schemas.microsoft.com/office/word/2015/wordml/symex" mc:Ignorable="w14 w15 w16se w16cid w16 w16cex w16sdtdh w16du">
   <w:docDefaults>
     <w:rPrDefault>
       <w:rPr>
@@ -166,7 +161,7 @@
       </w:pPr>
     </w:pPrDefault>
   </w:docDefaults>
-  <w:latentStyles w:defLockedState="0" w:defUIPriority="99" w:defSemiHidden="0" w:defUnhideWhenUsed="0" w:defQFormat="0" w:count="375">
+  <w:latentStyles w:defLockedState="0" w:defUIPriority="99" w:defSemiHidden="0" w:defUnhideWhenUsed="0" w:defQFormat="0" w:count="376">
     <w:lsdException w:name="Normal" w:uiPriority="0" w:qFormat="1"/>
     <w:lsdException w:name="heading 1" w:uiPriority="9" w:qFormat="1"/>
     <w:lsdException w:name="heading 2" w:semiHidden="1" w:uiPriority="9" w:unhideWhenUsed="1" w:qFormat="1"/>
@@ -542,6 +537,7 @@
     <w:lsdException w:name="Smart Hyperlink" w:semiHidden="1" w:unhideWhenUsed="1"/>
     <w:lsdException w:name="Hashtag" w:semiHidden="1" w:unhideWhenUsed="1"/>
     <w:lsdException w:name="Unresolved Mention" w:semiHidden="1" w:unhideWhenUsed="1"/>
+    <w:lsdException w:name="Smart Link" w:semiHidden="1" w:unhideWhenUsed="1"/>
   </w:latentStyles>
   <w:style w:type="paragraph" w:default="1" w:styleId="Normal">
     <w:name w:val="Normal"/>

</xml_diff>